<commit_message>
update Environmental_Control_Device Verification Environment
</commit_message>
<xml_diff>
--- a/Environmental_Control_Device/doc/Environmental Control Device Specification.docx
+++ b/Environmental_Control_Device/doc/Environmental Control Device Specification.docx
@@ -74,7 +74,7 @@
           <w:noProof/>
         </w:rPr>
         <w:drawing>
-          <wp:anchor distT="0" distB="0" distL="114300" distR="114300" simplePos="0" relativeHeight="251662336" behindDoc="0" locked="0" layoutInCell="1" hidden="0" allowOverlap="1" wp14:anchorId="3F56CE54" wp14:editId="3C74F223">
+          <wp:anchor distT="0" distB="0" distL="114300" distR="114300" simplePos="0" relativeHeight="251662336" behindDoc="0" locked="0" layoutInCell="1" hidden="0" allowOverlap="1" wp14:anchorId="3F56CE54" wp14:editId="2B4599EB">
             <wp:simplePos x="0" y="0"/>
             <wp:positionH relativeFrom="column">
               <wp:posOffset>2562225</wp:posOffset>
@@ -392,7 +392,7 @@
           <w:r>
             <w:fldChar w:fldCharType="separate"/>
           </w:r>
-          <w:hyperlink w:anchor="_Toc231082361" w:history="1">
+          <w:hyperlink w:anchor="_Toc231931720" w:history="1">
             <w:r>
               <w:rPr>
                 <w:rStyle w:val="Hyperlink"/>
@@ -436,7 +436,7 @@
                 <w:noProof/>
                 <w:webHidden/>
               </w:rPr>
-              <w:instrText xml:space="preserve"> PAGEREF _Toc231082361 \h </w:instrText>
+              <w:instrText xml:space="preserve"> PAGEREF _Toc231931720 \h </w:instrText>
             </w:r>
             <w:r>
               <w:rPr>
@@ -478,7 +478,7 @@
               <w14:ligatures w14:val="standardContextual"/>
             </w:rPr>
           </w:pPr>
-          <w:hyperlink w:anchor="_Toc231082362" w:history="1">
+          <w:hyperlink w:anchor="_Toc231931721" w:history="1">
             <w:r>
               <w:rPr>
                 <w:rStyle w:val="Hyperlink"/>
@@ -522,7 +522,7 @@
                 <w:noProof/>
                 <w:webHidden/>
               </w:rPr>
-              <w:instrText xml:space="preserve"> PAGEREF _Toc231082362 \h </w:instrText>
+              <w:instrText xml:space="preserve"> PAGEREF _Toc231931721 \h </w:instrText>
             </w:r>
             <w:r>
               <w:rPr>
@@ -564,7 +564,7 @@
               <w14:ligatures w14:val="standardContextual"/>
             </w:rPr>
           </w:pPr>
-          <w:hyperlink w:anchor="_Toc231082363" w:history="1">
+          <w:hyperlink w:anchor="_Toc231931722" w:history="1">
             <w:r>
               <w:rPr>
                 <w:rStyle w:val="Hyperlink"/>
@@ -608,7 +608,7 @@
                 <w:noProof/>
                 <w:webHidden/>
               </w:rPr>
-              <w:instrText xml:space="preserve"> PAGEREF _Toc231082363 \h </w:instrText>
+              <w:instrText xml:space="preserve"> PAGEREF _Toc231931722 \h </w:instrText>
             </w:r>
             <w:r>
               <w:rPr>
@@ -650,7 +650,7 @@
               <w14:ligatures w14:val="standardContextual"/>
             </w:rPr>
           </w:pPr>
-          <w:hyperlink w:anchor="_Toc231082364" w:history="1">
+          <w:hyperlink w:anchor="_Toc231931723" w:history="1">
             <w:r>
               <w:rPr>
                 <w:rStyle w:val="Hyperlink"/>
@@ -694,7 +694,7 @@
                 <w:noProof/>
                 <w:webHidden/>
               </w:rPr>
-              <w:instrText xml:space="preserve"> PAGEREF _Toc231082364 \h </w:instrText>
+              <w:instrText xml:space="preserve"> PAGEREF _Toc231931723 \h </w:instrText>
             </w:r>
             <w:r>
               <w:rPr>
@@ -736,7 +736,7 @@
               <w14:ligatures w14:val="standardContextual"/>
             </w:rPr>
           </w:pPr>
-          <w:hyperlink w:anchor="_Toc231082365" w:history="1">
+          <w:hyperlink w:anchor="_Toc231931724" w:history="1">
             <w:r>
               <w:rPr>
                 <w:rStyle w:val="Hyperlink"/>
@@ -780,7 +780,7 @@
                 <w:noProof/>
                 <w:webHidden/>
               </w:rPr>
-              <w:instrText xml:space="preserve"> PAGEREF _Toc231082365 \h </w:instrText>
+              <w:instrText xml:space="preserve"> PAGEREF _Toc231931724 \h </w:instrText>
             </w:r>
             <w:r>
               <w:rPr>
@@ -822,7 +822,7 @@
               <w14:ligatures w14:val="standardContextual"/>
             </w:rPr>
           </w:pPr>
-          <w:hyperlink w:anchor="_Toc231082366" w:history="1">
+          <w:hyperlink w:anchor="_Toc231931725" w:history="1">
             <w:r>
               <w:rPr>
                 <w:rStyle w:val="Hyperlink"/>
@@ -866,7 +866,7 @@
                 <w:noProof/>
                 <w:webHidden/>
               </w:rPr>
-              <w:instrText xml:space="preserve"> PAGEREF _Toc231082366 \h </w:instrText>
+              <w:instrText xml:space="preserve"> PAGEREF _Toc231931725 \h </w:instrText>
             </w:r>
             <w:r>
               <w:rPr>
@@ -908,7 +908,7 @@
               <w14:ligatures w14:val="standardContextual"/>
             </w:rPr>
           </w:pPr>
-          <w:hyperlink w:anchor="_Toc231082367" w:history="1">
+          <w:hyperlink w:anchor="_Toc231931726" w:history="1">
             <w:r>
               <w:rPr>
                 <w:rStyle w:val="Hyperlink"/>
@@ -952,7 +952,7 @@
                 <w:noProof/>
                 <w:webHidden/>
               </w:rPr>
-              <w:instrText xml:space="preserve"> PAGEREF _Toc231082367 \h </w:instrText>
+              <w:instrText xml:space="preserve"> PAGEREF _Toc231931726 \h </w:instrText>
             </w:r>
             <w:r>
               <w:rPr>
@@ -994,7 +994,7 @@
               <w14:ligatures w14:val="standardContextual"/>
             </w:rPr>
           </w:pPr>
-          <w:hyperlink w:anchor="_Toc231082368" w:history="1">
+          <w:hyperlink w:anchor="_Toc231931727" w:history="1">
             <w:r>
               <w:rPr>
                 <w:rStyle w:val="Hyperlink"/>
@@ -1038,7 +1038,7 @@
                 <w:noProof/>
                 <w:webHidden/>
               </w:rPr>
-              <w:instrText xml:space="preserve"> PAGEREF _Toc231082368 \h </w:instrText>
+              <w:instrText xml:space="preserve"> PAGEREF _Toc231931727 \h </w:instrText>
             </w:r>
             <w:r>
               <w:rPr>
@@ -1080,7 +1080,7 @@
               <w14:ligatures w14:val="standardContextual"/>
             </w:rPr>
           </w:pPr>
-          <w:hyperlink w:anchor="_Toc231082369" w:history="1">
+          <w:hyperlink w:anchor="_Toc231931728" w:history="1">
             <w:r>
               <w:rPr>
                 <w:rStyle w:val="Hyperlink"/>
@@ -1124,7 +1124,7 @@
                 <w:noProof/>
                 <w:webHidden/>
               </w:rPr>
-              <w:instrText xml:space="preserve"> PAGEREF _Toc231082369 \h </w:instrText>
+              <w:instrText xml:space="preserve"> PAGEREF _Toc231931728 \h </w:instrText>
             </w:r>
             <w:r>
               <w:rPr>
@@ -1166,7 +1166,7 @@
               <w14:ligatures w14:val="standardContextual"/>
             </w:rPr>
           </w:pPr>
-          <w:hyperlink w:anchor="_Toc231082370" w:history="1">
+          <w:hyperlink w:anchor="_Toc231931729" w:history="1">
             <w:r>
               <w:rPr>
                 <w:rStyle w:val="Hyperlink"/>
@@ -1210,7 +1210,7 @@
                 <w:noProof/>
                 <w:webHidden/>
               </w:rPr>
-              <w:instrText xml:space="preserve"> PAGEREF _Toc231082370 \h </w:instrText>
+              <w:instrText xml:space="preserve"> PAGEREF _Toc231931729 \h </w:instrText>
             </w:r>
             <w:r>
               <w:rPr>
@@ -1230,7 +1230,7 @@
                 <w:noProof/>
                 <w:webHidden/>
               </w:rPr>
-              <w:t>9</w:t>
+              <w:t>8</w:t>
             </w:r>
             <w:r>
               <w:rPr>
@@ -1252,7 +1252,7 @@
               <w14:ligatures w14:val="standardContextual"/>
             </w:rPr>
           </w:pPr>
-          <w:hyperlink w:anchor="_Toc231082371" w:history="1">
+          <w:hyperlink w:anchor="_Toc231931730" w:history="1">
             <w:r>
               <w:rPr>
                 <w:rStyle w:val="Hyperlink"/>
@@ -1296,7 +1296,7 @@
                 <w:noProof/>
                 <w:webHidden/>
               </w:rPr>
-              <w:instrText xml:space="preserve"> PAGEREF _Toc231082371 \h </w:instrText>
+              <w:instrText xml:space="preserve"> PAGEREF _Toc231931730 \h </w:instrText>
             </w:r>
             <w:r>
               <w:rPr>
@@ -1338,7 +1338,7 @@
               <w14:ligatures w14:val="standardContextual"/>
             </w:rPr>
           </w:pPr>
-          <w:hyperlink w:anchor="_Toc231082372" w:history="1">
+          <w:hyperlink w:anchor="_Toc231931731" w:history="1">
             <w:r>
               <w:rPr>
                 <w:rStyle w:val="Hyperlink"/>
@@ -1382,7 +1382,7 @@
                 <w:noProof/>
                 <w:webHidden/>
               </w:rPr>
-              <w:instrText xml:space="preserve"> PAGEREF _Toc231082372 \h </w:instrText>
+              <w:instrText xml:space="preserve"> PAGEREF _Toc231931731 \h </w:instrText>
             </w:r>
             <w:r>
               <w:rPr>
@@ -1424,7 +1424,7 @@
               <w14:ligatures w14:val="standardContextual"/>
             </w:rPr>
           </w:pPr>
-          <w:hyperlink w:anchor="_Toc231082373" w:history="1">
+          <w:hyperlink w:anchor="_Toc231931732" w:history="1">
             <w:r>
               <w:rPr>
                 <w:rStyle w:val="Hyperlink"/>
@@ -1468,7 +1468,7 @@
                 <w:noProof/>
                 <w:webHidden/>
               </w:rPr>
-              <w:instrText xml:space="preserve"> PAGEREF _Toc231082373 \h </w:instrText>
+              <w:instrText xml:space="preserve"> PAGEREF _Toc231931732 \h </w:instrText>
             </w:r>
             <w:r>
               <w:rPr>
@@ -1510,7 +1510,7 @@
               <w14:ligatures w14:val="standardContextual"/>
             </w:rPr>
           </w:pPr>
-          <w:hyperlink w:anchor="_Toc231082374" w:history="1">
+          <w:hyperlink w:anchor="_Toc231931733" w:history="1">
             <w:r>
               <w:rPr>
                 <w:rStyle w:val="Hyperlink"/>
@@ -1554,7 +1554,7 @@
                 <w:noProof/>
                 <w:webHidden/>
               </w:rPr>
-              <w:instrText xml:space="preserve"> PAGEREF _Toc231082374 \h </w:instrText>
+              <w:instrText xml:space="preserve"> PAGEREF _Toc231931733 \h </w:instrText>
             </w:r>
             <w:r>
               <w:rPr>
@@ -1596,7 +1596,7 @@
               <w14:ligatures w14:val="standardContextual"/>
             </w:rPr>
           </w:pPr>
-          <w:hyperlink w:anchor="_Toc231082375" w:history="1">
+          <w:hyperlink w:anchor="_Toc231931734" w:history="1">
             <w:r>
               <w:rPr>
                 <w:rStyle w:val="Hyperlink"/>
@@ -1640,7 +1640,7 @@
                 <w:noProof/>
                 <w:webHidden/>
               </w:rPr>
-              <w:instrText xml:space="preserve"> PAGEREF _Toc231082375 \h </w:instrText>
+              <w:instrText xml:space="preserve"> PAGEREF _Toc231931734 \h </w:instrText>
             </w:r>
             <w:r>
               <w:rPr>
@@ -1682,7 +1682,7 @@
               <w14:ligatures w14:val="standardContextual"/>
             </w:rPr>
           </w:pPr>
-          <w:hyperlink w:anchor="_Toc231082376" w:history="1">
+          <w:hyperlink w:anchor="_Toc231931735" w:history="1">
             <w:r>
               <w:rPr>
                 <w:rStyle w:val="Hyperlink"/>
@@ -1726,7 +1726,7 @@
                 <w:noProof/>
                 <w:webHidden/>
               </w:rPr>
-              <w:instrText xml:space="preserve"> PAGEREF _Toc231082376 \h </w:instrText>
+              <w:instrText xml:space="preserve"> PAGEREF _Toc231931735 \h </w:instrText>
             </w:r>
             <w:r>
               <w:rPr>
@@ -1768,7 +1768,7 @@
               <w14:ligatures w14:val="standardContextual"/>
             </w:rPr>
           </w:pPr>
-          <w:hyperlink w:anchor="_Toc231082377" w:history="1">
+          <w:hyperlink w:anchor="_Toc231931736" w:history="1">
             <w:r>
               <w:rPr>
                 <w:rStyle w:val="Hyperlink"/>
@@ -1812,7 +1812,7 @@
                 <w:noProof/>
                 <w:webHidden/>
               </w:rPr>
-              <w:instrText xml:space="preserve"> PAGEREF _Toc231082377 \h </w:instrText>
+              <w:instrText xml:space="preserve"> PAGEREF _Toc231931736 \h </w:instrText>
             </w:r>
             <w:r>
               <w:rPr>
@@ -1854,7 +1854,7 @@
               <w14:ligatures w14:val="standardContextual"/>
             </w:rPr>
           </w:pPr>
-          <w:hyperlink w:anchor="_Toc231082378" w:history="1">
+          <w:hyperlink w:anchor="_Toc231931737" w:history="1">
             <w:r>
               <w:rPr>
                 <w:rStyle w:val="Hyperlink"/>
@@ -1898,7 +1898,7 @@
                 <w:noProof/>
                 <w:webHidden/>
               </w:rPr>
-              <w:instrText xml:space="preserve"> PAGEREF _Toc231082378 \h </w:instrText>
+              <w:instrText xml:space="preserve"> PAGEREF _Toc231931737 \h </w:instrText>
             </w:r>
             <w:r>
               <w:rPr>
@@ -1940,7 +1940,7 @@
               <w14:ligatures w14:val="standardContextual"/>
             </w:rPr>
           </w:pPr>
-          <w:hyperlink w:anchor="_Toc231082379" w:history="1">
+          <w:hyperlink w:anchor="_Toc231931738" w:history="1">
             <w:r>
               <w:rPr>
                 <w:rStyle w:val="Hyperlink"/>
@@ -1984,7 +1984,7 @@
                 <w:noProof/>
                 <w:webHidden/>
               </w:rPr>
-              <w:instrText xml:space="preserve"> PAGEREF _Toc231082379 \h </w:instrText>
+              <w:instrText xml:space="preserve"> PAGEREF _Toc231931738 \h </w:instrText>
             </w:r>
             <w:r>
               <w:rPr>
@@ -2026,7 +2026,7 @@
               <w14:ligatures w14:val="standardContextual"/>
             </w:rPr>
           </w:pPr>
-          <w:hyperlink w:anchor="_Toc231082380" w:history="1">
+          <w:hyperlink w:anchor="_Toc231931739" w:history="1">
             <w:r>
               <w:rPr>
                 <w:rStyle w:val="Hyperlink"/>
@@ -2070,7 +2070,7 @@
                 <w:noProof/>
                 <w:webHidden/>
               </w:rPr>
-              <w:instrText xml:space="preserve"> PAGEREF _Toc231082380 \h </w:instrText>
+              <w:instrText xml:space="preserve"> PAGEREF _Toc231931739 \h </w:instrText>
             </w:r>
             <w:r>
               <w:rPr>
@@ -2090,7 +2090,7 @@
                 <w:noProof/>
                 <w:webHidden/>
               </w:rPr>
-              <w:t>11</w:t>
+              <w:t>10</w:t>
             </w:r>
             <w:r>
               <w:rPr>
@@ -2112,7 +2112,7 @@
               <w14:ligatures w14:val="standardContextual"/>
             </w:rPr>
           </w:pPr>
-          <w:hyperlink w:anchor="_Toc231082381" w:history="1">
+          <w:hyperlink w:anchor="_Toc231931740" w:history="1">
             <w:r>
               <w:rPr>
                 <w:rStyle w:val="Hyperlink"/>
@@ -2156,7 +2156,7 @@
                 <w:noProof/>
                 <w:webHidden/>
               </w:rPr>
-              <w:instrText xml:space="preserve"> PAGEREF _Toc231082381 \h </w:instrText>
+              <w:instrText xml:space="preserve"> PAGEREF _Toc231931740 \h </w:instrText>
             </w:r>
             <w:r>
               <w:rPr>
@@ -2176,7 +2176,7 @@
                 <w:noProof/>
                 <w:webHidden/>
               </w:rPr>
-              <w:t>11</w:t>
+              <w:t>10</w:t>
             </w:r>
             <w:r>
               <w:rPr>
@@ -2198,7 +2198,7 @@
               <w14:ligatures w14:val="standardContextual"/>
             </w:rPr>
           </w:pPr>
-          <w:hyperlink w:anchor="_Toc231082382" w:history="1">
+          <w:hyperlink w:anchor="_Toc231931741" w:history="1">
             <w:r>
               <w:rPr>
                 <w:rStyle w:val="Hyperlink"/>
@@ -2242,7 +2242,7 @@
                 <w:noProof/>
                 <w:webHidden/>
               </w:rPr>
-              <w:instrText xml:space="preserve"> PAGEREF _Toc231082382 \h </w:instrText>
+              <w:instrText xml:space="preserve"> PAGEREF _Toc231931741 \h </w:instrText>
             </w:r>
             <w:r>
               <w:rPr>
@@ -2284,7 +2284,7 @@
               <w14:ligatures w14:val="standardContextual"/>
             </w:rPr>
           </w:pPr>
-          <w:hyperlink w:anchor="_Toc231082383" w:history="1">
+          <w:hyperlink w:anchor="_Toc231931742" w:history="1">
             <w:r>
               <w:rPr>
                 <w:rStyle w:val="Hyperlink"/>
@@ -2328,7 +2328,7 @@
                 <w:noProof/>
                 <w:webHidden/>
               </w:rPr>
-              <w:instrText xml:space="preserve"> PAGEREF _Toc231082383 \h </w:instrText>
+              <w:instrText xml:space="preserve"> PAGEREF _Toc231931742 \h </w:instrText>
             </w:r>
             <w:r>
               <w:rPr>
@@ -2370,7 +2370,7 @@
               <w14:ligatures w14:val="standardContextual"/>
             </w:rPr>
           </w:pPr>
-          <w:hyperlink w:anchor="_Toc231082384" w:history="1">
+          <w:hyperlink w:anchor="_Toc231931743" w:history="1">
             <w:r>
               <w:rPr>
                 <w:rStyle w:val="Hyperlink"/>
@@ -2414,7 +2414,7 @@
                 <w:noProof/>
                 <w:webHidden/>
               </w:rPr>
-              <w:instrText xml:space="preserve"> PAGEREF _Toc231082384 \h </w:instrText>
+              <w:instrText xml:space="preserve"> PAGEREF _Toc231931743 \h </w:instrText>
             </w:r>
             <w:r>
               <w:rPr>
@@ -2456,7 +2456,7 @@
               <w14:ligatures w14:val="standardContextual"/>
             </w:rPr>
           </w:pPr>
-          <w:hyperlink w:anchor="_Toc231082385" w:history="1">
+          <w:hyperlink w:anchor="_Toc231931744" w:history="1">
             <w:r>
               <w:rPr>
                 <w:rStyle w:val="Hyperlink"/>
@@ -2500,7 +2500,7 @@
                 <w:noProof/>
                 <w:webHidden/>
               </w:rPr>
-              <w:instrText xml:space="preserve"> PAGEREF _Toc231082385 \h </w:instrText>
+              <w:instrText xml:space="preserve"> PAGEREF _Toc231931744 \h </w:instrText>
             </w:r>
             <w:r>
               <w:rPr>
@@ -2542,7 +2542,7 @@
               <w14:ligatures w14:val="standardContextual"/>
             </w:rPr>
           </w:pPr>
-          <w:hyperlink w:anchor="_Toc231082386" w:history="1">
+          <w:hyperlink w:anchor="_Toc231931745" w:history="1">
             <w:r>
               <w:rPr>
                 <w:rStyle w:val="Hyperlink"/>
@@ -2586,7 +2586,7 @@
                 <w:noProof/>
                 <w:webHidden/>
               </w:rPr>
-              <w:instrText xml:space="preserve"> PAGEREF _Toc231082386 \h </w:instrText>
+              <w:instrText xml:space="preserve"> PAGEREF _Toc231931745 \h </w:instrText>
             </w:r>
             <w:r>
               <w:rPr>
@@ -2606,7 +2606,7 @@
                 <w:noProof/>
                 <w:webHidden/>
               </w:rPr>
-              <w:t>12</w:t>
+              <w:t>11</w:t>
             </w:r>
             <w:r>
               <w:rPr>
@@ -2628,7 +2628,7 @@
               <w14:ligatures w14:val="standardContextual"/>
             </w:rPr>
           </w:pPr>
-          <w:hyperlink w:anchor="_Toc231082387" w:history="1">
+          <w:hyperlink w:anchor="_Toc231931746" w:history="1">
             <w:r>
               <w:rPr>
                 <w:rStyle w:val="Hyperlink"/>
@@ -2672,7 +2672,7 @@
                 <w:noProof/>
                 <w:webHidden/>
               </w:rPr>
-              <w:instrText xml:space="preserve"> PAGEREF _Toc231082387 \h </w:instrText>
+              <w:instrText xml:space="preserve"> PAGEREF _Toc231931746 \h </w:instrText>
             </w:r>
             <w:r>
               <w:rPr>
@@ -2714,7 +2714,7 @@
               <w14:ligatures w14:val="standardContextual"/>
             </w:rPr>
           </w:pPr>
-          <w:hyperlink w:anchor="_Toc231082388" w:history="1">
+          <w:hyperlink w:anchor="_Toc231931747" w:history="1">
             <w:r>
               <w:rPr>
                 <w:rStyle w:val="Hyperlink"/>
@@ -2758,7 +2758,7 @@
                 <w:noProof/>
                 <w:webHidden/>
               </w:rPr>
-              <w:instrText xml:space="preserve"> PAGEREF _Toc231082388 \h </w:instrText>
+              <w:instrText xml:space="preserve"> PAGEREF _Toc231931747 \h </w:instrText>
             </w:r>
             <w:r>
               <w:rPr>
@@ -2800,7 +2800,7 @@
               <w14:ligatures w14:val="standardContextual"/>
             </w:rPr>
           </w:pPr>
-          <w:hyperlink w:anchor="_Toc231082389" w:history="1">
+          <w:hyperlink w:anchor="_Toc231931748" w:history="1">
             <w:r>
               <w:rPr>
                 <w:rStyle w:val="Hyperlink"/>
@@ -2844,7 +2844,7 @@
                 <w:noProof/>
                 <w:webHidden/>
               </w:rPr>
-              <w:instrText xml:space="preserve"> PAGEREF _Toc231082389 \h </w:instrText>
+              <w:instrText xml:space="preserve"> PAGEREF _Toc231931748 \h </w:instrText>
             </w:r>
             <w:r>
               <w:rPr>
@@ -2864,7 +2864,7 @@
                 <w:noProof/>
                 <w:webHidden/>
               </w:rPr>
-              <w:t>13</w:t>
+              <w:t>12</w:t>
             </w:r>
             <w:r>
               <w:rPr>
@@ -2886,7 +2886,7 @@
               <w14:ligatures w14:val="standardContextual"/>
             </w:rPr>
           </w:pPr>
-          <w:hyperlink w:anchor="_Toc231082390" w:history="1">
+          <w:hyperlink w:anchor="_Toc231931749" w:history="1">
             <w:r>
               <w:rPr>
                 <w:rStyle w:val="Hyperlink"/>
@@ -2930,7 +2930,7 @@
                 <w:noProof/>
                 <w:webHidden/>
               </w:rPr>
-              <w:instrText xml:space="preserve"> PAGEREF _Toc231082390 \h </w:instrText>
+              <w:instrText xml:space="preserve"> PAGEREF _Toc231931749 \h </w:instrText>
             </w:r>
             <w:r>
               <w:rPr>
@@ -2972,7 +2972,7 @@
               <w14:ligatures w14:val="standardContextual"/>
             </w:rPr>
           </w:pPr>
-          <w:hyperlink w:anchor="_Toc231082391" w:history="1">
+          <w:hyperlink w:anchor="_Toc231931750" w:history="1">
             <w:r>
               <w:rPr>
                 <w:rStyle w:val="Hyperlink"/>
@@ -3016,7 +3016,7 @@
                 <w:noProof/>
                 <w:webHidden/>
               </w:rPr>
-              <w:instrText xml:space="preserve"> PAGEREF _Toc231082391 \h </w:instrText>
+              <w:instrText xml:space="preserve"> PAGEREF _Toc231931750 \h </w:instrText>
             </w:r>
             <w:r>
               <w:rPr>
@@ -3062,17 +3062,9 @@
     <w:p>
       <w:pPr>
         <w:pStyle w:val="Heading1"/>
-        <w:numPr>
-          <w:ilvl w:val="0"/>
-          <w:numId w:val="22"/>
-        </w:numPr>
-        <w:pBdr>
-          <w:bottom w:val="none" w:sz="0" w:space="0" w:color="000000"/>
-        </w:pBdr>
-        <w:ind w:left="720" w:right="169" w:hanging="360"/>
       </w:pPr>
       <w:bookmarkStart w:id="1" w:name="_Toc227423898"/>
-      <w:bookmarkStart w:id="2" w:name="_Toc231082361"/>
+      <w:bookmarkStart w:id="2" w:name="_Toc231931720"/>
       <w:r>
         <w:lastRenderedPageBreak/>
         <w:t>The digital design of the circuit</w:t>
@@ -3204,7 +3196,7 @@
           <w:numId w:val="8"/>
         </w:numPr>
       </w:pPr>
-      <w:bookmarkStart w:id="3" w:name="_Toc231082362"/>
+      <w:bookmarkStart w:id="3" w:name="_Toc231931721"/>
       <w:r>
         <w:t>Block Diagram</w:t>
       </w:r>
@@ -3343,7 +3335,7 @@
         </w:numPr>
       </w:pPr>
       <w:bookmarkStart w:id="4" w:name="_Toc230906330"/>
-      <w:bookmarkStart w:id="5" w:name="_Toc231082363"/>
+      <w:bookmarkStart w:id="5" w:name="_Toc231931722"/>
       <w:r>
         <w:t>Description of the general functionality of the DUT (Device Under Test)</w:t>
       </w:r>
@@ -4131,7 +4123,7 @@
         </w:numPr>
       </w:pPr>
       <w:bookmarkStart w:id="6" w:name="_Toc230906331"/>
-      <w:bookmarkStart w:id="7" w:name="_Toc231082364"/>
+      <w:bookmarkStart w:id="7" w:name="_Toc231931723"/>
       <w:r>
         <w:t>DUT Interfaces</w:t>
       </w:r>
@@ -6888,12 +6880,12 @@
           <w:numId w:val="8"/>
         </w:numPr>
       </w:pPr>
-      <w:bookmarkStart w:id="8" w:name="_Toc231082365"/>
-      <w:bookmarkStart w:id="9" w:name="_Toc230906332"/>
+      <w:bookmarkStart w:id="8" w:name="_Toc230906332"/>
+      <w:bookmarkStart w:id="9" w:name="_Toc231931724"/>
       <w:r>
         <w:t>List of DUT Functionalities</w:t>
       </w:r>
-      <w:bookmarkEnd w:id="8"/>
+      <w:bookmarkEnd w:id="9"/>
     </w:p>
     <w:p>
       <w:pPr>
@@ -7033,7 +7025,7 @@
           <w:numId w:val="8"/>
         </w:numPr>
       </w:pPr>
-      <w:bookmarkStart w:id="10" w:name="_Toc231082366"/>
+      <w:bookmarkStart w:id="10" w:name="_Toc231931725"/>
       <w:r>
         <w:lastRenderedPageBreak/>
         <w:t>Waveforms</w:t>
@@ -7133,28 +7125,9 @@
     <w:p>
       <w:pPr>
         <w:pStyle w:val="Heading1"/>
-        <w:numPr>
-          <w:ilvl w:val="0"/>
-          <w:numId w:val="22"/>
-        </w:numPr>
-        <w:pBdr>
-          <w:top w:val="none" w:sz="0" w:space="0" w:color="auto"/>
-          <w:left w:val="none" w:sz="0" w:space="0" w:color="auto"/>
-          <w:bottom w:val="none" w:sz="0" w:space="0" w:color="000000"/>
-          <w:right w:val="none" w:sz="0" w:space="0" w:color="auto"/>
-          <w:between w:val="none" w:sz="0" w:space="0" w:color="auto"/>
-        </w:pBdr>
-        <w:spacing w:line="288" w:lineRule="auto"/>
-        <w:ind w:right="169"/>
-        <w:rPr>
-          <w:color w:val="000000"/>
-        </w:rPr>
-      </w:pPr>
-      <w:bookmarkStart w:id="11" w:name="_Toc231082367"/>
-      <w:r>
-        <w:rPr>
-          <w:color w:val="000000"/>
-        </w:rPr>
+      </w:pPr>
+      <w:bookmarkStart w:id="11" w:name="_Toc231931726"/>
+      <w:r>
         <w:lastRenderedPageBreak/>
         <w:t>DIGITAL CIRCUIT VERIFICATION</w:t>
       </w:r>
@@ -7344,8 +7317,8 @@
         </w:pBdr>
       </w:pPr>
       <w:bookmarkStart w:id="12" w:name="_Toc227423907"/>
-      <w:bookmarkStart w:id="13" w:name="_Toc231082368"/>
-      <w:bookmarkEnd w:id="9"/>
+      <w:bookmarkStart w:id="13" w:name="_Toc231931727"/>
+      <w:bookmarkEnd w:id="8"/>
       <w:r>
         <w:t>Verification Environment Architecture</w:t>
       </w:r>
@@ -7354,17 +7327,21 @@
     </w:p>
     <w:p>
       <w:pPr>
-        <w:keepNext/>
+        <w:jc w:val="center"/>
+        <w:rPr>
+          <w:lang w:val="ro-RO" w:eastAsia="ro-RO"/>
+        </w:rPr>
       </w:pPr>
       <w:r>
         <w:rPr>
           <w:noProof/>
+          <w:lang w:val="ro-RO" w:eastAsia="ro-RO"/>
         </w:rPr>
         <w:drawing>
-          <wp:inline distT="0" distB="0" distL="0" distR="0" wp14:anchorId="75DADE7C" wp14:editId="3662A42F">
-            <wp:extent cx="6115050" cy="4410075"/>
-            <wp:effectExtent l="0" t="0" r="0" b="9525"/>
-            <wp:docPr id="265382036" name="Picture 4"/>
+          <wp:inline distT="0" distB="0" distL="0" distR="0" wp14:anchorId="7EE9314F" wp14:editId="4D5E0729">
+            <wp:extent cx="4286250" cy="3093624"/>
+            <wp:effectExtent l="0" t="0" r="0" b="0"/>
+            <wp:docPr id="1740012917" name="Picture 1"/>
             <wp:cNvGraphicFramePr>
               <a:graphicFrameLocks xmlns:a="http://schemas.openxmlformats.org/drawingml/2006/main" noChangeAspect="1"/>
             </wp:cNvGraphicFramePr>
@@ -7372,13 +7349,13 @@
               <a:graphicData uri="http://schemas.openxmlformats.org/drawingml/2006/picture">
                 <pic:pic xmlns:pic="http://schemas.openxmlformats.org/drawingml/2006/picture">
                   <pic:nvPicPr>
-                    <pic:cNvPr id="0" name="Picture 3"/>
+                    <pic:cNvPr id="0" name="Picture 1"/>
                     <pic:cNvPicPr>
                       <a:picLocks noChangeAspect="1" noChangeArrowheads="1"/>
                     </pic:cNvPicPr>
                   </pic:nvPicPr>
                   <pic:blipFill>
-                    <a:blip r:embed="rId13">
+                    <a:blip r:embed="rId13" cstate="print">
                       <a:extLst>
                         <a:ext uri="{28A0092B-C50C-407E-A947-70E740481C1C}">
                           <a14:useLocalDpi xmlns:a14="http://schemas.microsoft.com/office/drawing/2010/main" val="0"/>
@@ -7393,7 +7370,7 @@
                   <pic:spPr bwMode="auto">
                     <a:xfrm>
                       <a:off x="0" y="0"/>
-                      <a:ext cx="6115050" cy="4410075"/>
+                      <a:ext cx="4289829" cy="3096207"/>
                     </a:xfrm>
                     <a:prstGeom prst="rect">
                       <a:avLst/>
@@ -7464,7 +7441,7 @@
         </w:rPr>
       </w:pPr>
       <w:bookmarkStart w:id="14" w:name="_Toc230906337"/>
-      <w:bookmarkStart w:id="15" w:name="_Toc231082369"/>
+      <w:bookmarkStart w:id="15" w:name="_Toc231931728"/>
       <w:r>
         <w:rPr>
           <w:color w:val="000000"/>
@@ -7489,11 +7466,6 @@
       </w:pPr>
       <w:r>
         <w:t>The Sensor Agent is an active agent that encapsulates the Sequencer, Driver and Monitor into a single entity, connecting the components with the DUT using the virtual interface.</w:t>
-      </w:r>
-    </w:p>
-    <w:p>
-      <w:r>
-        <w:br w:type="page"/>
       </w:r>
     </w:p>
     <w:p>
@@ -7516,12 +7488,11 @@
         </w:rPr>
       </w:pPr>
       <w:bookmarkStart w:id="16" w:name="_Toc230906338"/>
-      <w:bookmarkStart w:id="17" w:name="_Toc231082370"/>
+      <w:bookmarkStart w:id="17" w:name="_Toc231931729"/>
       <w:r>
         <w:rPr>
           <w:color w:val="000000"/>
         </w:rPr>
-        <w:lastRenderedPageBreak/>
         <w:t>Sensor Transaction</w:t>
       </w:r>
       <w:bookmarkEnd w:id="16"/>
@@ -8288,11 +8259,12 @@
         </w:rPr>
       </w:pPr>
       <w:bookmarkStart w:id="18" w:name="_Toc230906339"/>
-      <w:bookmarkStart w:id="19" w:name="_Toc231082371"/>
+      <w:bookmarkStart w:id="19" w:name="_Toc231931730"/>
       <w:r>
         <w:rPr>
           <w:color w:val="000000"/>
         </w:rPr>
+        <w:lastRenderedPageBreak/>
         <w:t>Sensor Driver</w:t>
       </w:r>
       <w:bookmarkEnd w:id="18"/>
@@ -8358,7 +8330,7 @@
         </w:rPr>
       </w:pPr>
       <w:bookmarkStart w:id="20" w:name="_Toc230906340"/>
-      <w:bookmarkStart w:id="21" w:name="_Toc231082372"/>
+      <w:bookmarkStart w:id="21" w:name="_Toc231931731"/>
       <w:r>
         <w:rPr>
           <w:color w:val="000000"/>
@@ -8416,7 +8388,7 @@
         </w:rPr>
       </w:pPr>
       <w:bookmarkStart w:id="22" w:name="_Toc230906341"/>
-      <w:bookmarkStart w:id="23" w:name="_Toc231082373"/>
+      <w:bookmarkStart w:id="23" w:name="_Toc231931732"/>
       <w:r>
         <w:rPr>
           <w:color w:val="000000"/>
@@ -8515,7 +8487,7 @@
         </w:rPr>
       </w:pPr>
       <w:bookmarkStart w:id="24" w:name="_Toc230906342"/>
-      <w:bookmarkStart w:id="25" w:name="_Toc231082374"/>
+      <w:bookmarkStart w:id="25" w:name="_Toc231931733"/>
       <w:r>
         <w:rPr>
           <w:color w:val="000000"/>
@@ -8843,7 +8815,6 @@
             </w:pPr>
             <w:proofErr w:type="spellStart"/>
             <w:r>
-              <w:lastRenderedPageBreak/>
               <w:t>luminosity_sequence</w:t>
             </w:r>
             <w:proofErr w:type="spellEnd"/>
@@ -9027,11 +8998,12 @@
         </w:rPr>
       </w:pPr>
       <w:bookmarkStart w:id="26" w:name="_Toc230906343"/>
-      <w:bookmarkStart w:id="27" w:name="_Toc231082375"/>
+      <w:bookmarkStart w:id="27" w:name="_Toc231931734"/>
       <w:r>
         <w:rPr>
           <w:color w:val="000000"/>
         </w:rPr>
+        <w:lastRenderedPageBreak/>
         <w:t>Actuator</w:t>
       </w:r>
       <w:r>
@@ -9092,7 +9064,7 @@
         </w:rPr>
       </w:pPr>
       <w:bookmarkStart w:id="28" w:name="_Toc230906344"/>
-      <w:bookmarkStart w:id="29" w:name="_Toc231082376"/>
+      <w:bookmarkStart w:id="29" w:name="_Toc231931735"/>
       <w:r>
         <w:rPr>
           <w:color w:val="000000"/>
@@ -10032,7 +10004,7 @@
         </w:rPr>
       </w:pPr>
       <w:bookmarkStart w:id="30" w:name="_Toc230906345"/>
-      <w:bookmarkStart w:id="31" w:name="_Toc231082377"/>
+      <w:bookmarkStart w:id="31" w:name="_Toc231931736"/>
       <w:r>
         <w:rPr>
           <w:color w:val="000000"/>
@@ -10114,7 +10086,7 @@
         </w:rPr>
       </w:pPr>
       <w:bookmarkStart w:id="32" w:name="_Toc230906346"/>
-      <w:bookmarkStart w:id="33" w:name="_Toc231082378"/>
+      <w:bookmarkStart w:id="33" w:name="_Toc231931737"/>
       <w:r>
         <w:rPr>
           <w:color w:val="000000"/>
@@ -10212,7 +10184,7 @@
         </w:rPr>
       </w:pPr>
       <w:bookmarkStart w:id="34" w:name="_Toc230906347"/>
-      <w:bookmarkStart w:id="35" w:name="_Toc231082379"/>
+      <w:bookmarkStart w:id="35" w:name="_Toc231931738"/>
       <w:r>
         <w:rPr>
           <w:color w:val="000000"/>
@@ -10244,34 +10216,6 @@
       <w:r>
         <w:t xml:space="preserve"> Agent is an active agent that encapsulates the Sequencer, Driver and Monitor into a single entity, connecting the components with the DUT using the virtual interface.</w:t>
       </w:r>
-    </w:p>
-    <w:p>
-      <w:pPr>
-        <w:pBdr>
-          <w:top w:val="nil"/>
-          <w:left w:val="nil"/>
-          <w:bottom w:val="nil"/>
-          <w:right w:val="nil"/>
-          <w:between w:val="nil"/>
-        </w:pBdr>
-        <w:spacing w:line="288" w:lineRule="auto"/>
-        <w:ind w:firstLine="709"/>
-        <w:jc w:val="both"/>
-      </w:pPr>
-    </w:p>
-    <w:p>
-      <w:pPr>
-        <w:pBdr>
-          <w:top w:val="nil"/>
-          <w:left w:val="nil"/>
-          <w:bottom w:val="nil"/>
-          <w:right w:val="nil"/>
-          <w:between w:val="nil"/>
-        </w:pBdr>
-        <w:spacing w:line="288" w:lineRule="auto"/>
-        <w:ind w:firstLine="709"/>
-        <w:jc w:val="both"/>
-      </w:pPr>
     </w:p>
     <w:p>
       <w:pPr>
@@ -10293,12 +10237,11 @@
         </w:rPr>
       </w:pPr>
       <w:bookmarkStart w:id="36" w:name="_Toc230906348"/>
-      <w:bookmarkStart w:id="37" w:name="_Toc231082380"/>
+      <w:bookmarkStart w:id="37" w:name="_Toc231931739"/>
       <w:r>
         <w:rPr>
           <w:color w:val="000000"/>
         </w:rPr>
-        <w:lastRenderedPageBreak/>
         <w:t>Button Transaction</w:t>
       </w:r>
       <w:bookmarkEnd w:id="36"/>
@@ -10763,7 +10706,7 @@
         </w:rPr>
       </w:pPr>
       <w:bookmarkStart w:id="38" w:name="_Toc230906349"/>
-      <w:bookmarkStart w:id="39" w:name="_Toc231082381"/>
+      <w:bookmarkStart w:id="39" w:name="_Toc231931740"/>
       <w:r>
         <w:rPr>
           <w:color w:val="000000"/>
@@ -10816,11 +10759,12 @@
         </w:rPr>
       </w:pPr>
       <w:bookmarkStart w:id="40" w:name="_Toc230906350"/>
-      <w:bookmarkStart w:id="41" w:name="_Toc231082382"/>
+      <w:bookmarkStart w:id="41" w:name="_Toc231931741"/>
       <w:r>
         <w:rPr>
           <w:color w:val="000000"/>
         </w:rPr>
+        <w:lastRenderedPageBreak/>
         <w:t>Button Monitor</w:t>
       </w:r>
       <w:bookmarkEnd w:id="40"/>
@@ -10880,7 +10824,7 @@
         </w:rPr>
       </w:pPr>
       <w:bookmarkStart w:id="42" w:name="_Toc230906351"/>
-      <w:bookmarkStart w:id="43" w:name="_Toc231082383"/>
+      <w:bookmarkStart w:id="43" w:name="_Toc231931742"/>
       <w:r>
         <w:rPr>
           <w:color w:val="000000"/>
@@ -10943,7 +10887,7 @@
         </w:rPr>
       </w:pPr>
       <w:bookmarkStart w:id="44" w:name="_Toc230906352"/>
-      <w:bookmarkStart w:id="45" w:name="_Toc231082384"/>
+      <w:bookmarkStart w:id="45" w:name="_Toc231931743"/>
       <w:r>
         <w:rPr>
           <w:color w:val="000000"/>
@@ -11362,7 +11306,7 @@
         </w:rPr>
       </w:pPr>
       <w:bookmarkStart w:id="46" w:name="_Toc230906353"/>
-      <w:bookmarkStart w:id="47" w:name="_Toc231082385"/>
+      <w:bookmarkStart w:id="47" w:name="_Toc231931744"/>
       <w:r>
         <w:rPr>
           <w:color w:val="000000"/>
@@ -11426,7 +11370,6 @@
         <w:jc w:val="both"/>
       </w:pPr>
       <w:r>
-        <w:lastRenderedPageBreak/>
         <w:t xml:space="preserve">When receiving a Sensor Transaction, </w:t>
       </w:r>
       <w:r>
@@ -11508,7 +11451,7 @@
         </w:rPr>
       </w:pPr>
       <w:bookmarkStart w:id="48" w:name="_Toc230906354"/>
-      <w:bookmarkStart w:id="49" w:name="_Toc231082386"/>
+      <w:bookmarkStart w:id="49" w:name="_Toc231931745"/>
       <w:r>
         <w:rPr>
           <w:color w:val="000000"/>
@@ -11540,7 +11483,11 @@
       </w:r>
       <w:proofErr w:type="spellEnd"/>
       <w:r>
-        <w:t xml:space="preserve"> cover group with 4 cover points: </w:t>
+        <w:t xml:space="preserve"> cover group with 4 </w:t>
+      </w:r>
+      <w:r>
+        <w:lastRenderedPageBreak/>
+        <w:t xml:space="preserve">cover points: </w:t>
       </w:r>
       <w:proofErr w:type="spellStart"/>
       <w:r>
@@ -11613,18 +11560,6 @@
       <w:r>
         <w:t>.</w:t>
       </w:r>
-    </w:p>
-    <w:p>
-      <w:pPr>
-        <w:pBdr>
-          <w:top w:val="nil"/>
-          <w:left w:val="nil"/>
-          <w:bottom w:val="nil"/>
-          <w:right w:val="nil"/>
-          <w:between w:val="nil"/>
-        </w:pBdr>
-        <w:ind w:left="-76"/>
-      </w:pPr>
     </w:p>
     <w:p>
       <w:pPr>
@@ -11642,7 +11577,7 @@
         </w:pBdr>
       </w:pPr>
       <w:bookmarkStart w:id="50" w:name="_Toc230906355"/>
-      <w:bookmarkStart w:id="51" w:name="_Toc231082387"/>
+      <w:bookmarkStart w:id="51" w:name="_Toc231931746"/>
       <w:r>
         <w:t>Verification Checklist</w:t>
       </w:r>
@@ -11669,7 +11604,7 @@
         </w:rPr>
       </w:pPr>
       <w:bookmarkStart w:id="52" w:name="_Toc230906356"/>
-      <w:bookmarkStart w:id="53" w:name="_Toc231082388"/>
+      <w:bookmarkStart w:id="53" w:name="_Toc231931747"/>
       <w:r>
         <w:rPr>
           <w:color w:val="000000"/>
@@ -12207,12 +12142,6 @@
         </w:tc>
       </w:tr>
     </w:tbl>
-    <w:p/>
-    <w:p>
-      <w:r>
-        <w:br w:type="page"/>
-      </w:r>
-    </w:p>
     <w:p>
       <w:pPr>
         <w:pStyle w:val="Heading2"/>
@@ -12229,9 +12158,8 @@
         </w:pBdr>
       </w:pPr>
       <w:bookmarkStart w:id="54" w:name="_Toc230906357"/>
-      <w:bookmarkStart w:id="55" w:name="_Toc231082389"/>
-      <w:r>
-        <w:lastRenderedPageBreak/>
+      <w:bookmarkStart w:id="55" w:name="_Toc231931748"/>
+      <w:r>
         <w:t>Functional Coverage Elements</w:t>
       </w:r>
       <w:bookmarkEnd w:id="54"/>
@@ -12944,6 +12872,25 @@
       </w:tr>
     </w:tbl>
     <w:p/>
+    <w:p/>
+    <w:p/>
+    <w:p>
+      <w:pPr>
+        <w:pBdr>
+          <w:top w:val="nil"/>
+          <w:left w:val="nil"/>
+          <w:bottom w:val="nil"/>
+          <w:right w:val="nil"/>
+          <w:between w:val="nil"/>
+        </w:pBdr>
+        <w:spacing w:line="288" w:lineRule="auto"/>
+        <w:ind w:firstLine="720"/>
+        <w:jc w:val="both"/>
+        <w:rPr>
+          <w:color w:val="000000"/>
+        </w:rPr>
+      </w:pPr>
+    </w:p>
     <w:p>
       <w:pPr>
         <w:pBdr>
@@ -15369,6 +15316,7 @@
               <w:jc w:val="both"/>
             </w:pPr>
             <w:r>
+              <w:lastRenderedPageBreak/>
               <w:t>luminous</w:t>
             </w:r>
           </w:p>
@@ -17020,7 +16968,6 @@
               <w:rPr>
                 <w:lang w:val="ro-RO"/>
               </w:rPr>
-              <w:lastRenderedPageBreak/>
               <w:t>humidity_cross</w:t>
             </w:r>
             <w:proofErr w:type="spellEnd"/>
@@ -17297,6 +17244,41 @@
         </w:tc>
       </w:tr>
     </w:tbl>
+    <w:p>
+      <w:pPr>
+        <w:tabs>
+          <w:tab w:val="left" w:pos="2175"/>
+        </w:tabs>
+      </w:pPr>
+    </w:p>
+    <w:p>
+      <w:pPr>
+        <w:tabs>
+          <w:tab w:val="left" w:pos="2175"/>
+        </w:tabs>
+      </w:pPr>
+    </w:p>
+    <w:p>
+      <w:pPr>
+        <w:tabs>
+          <w:tab w:val="left" w:pos="2175"/>
+        </w:tabs>
+      </w:pPr>
+    </w:p>
+    <w:p>
+      <w:pPr>
+        <w:tabs>
+          <w:tab w:val="left" w:pos="2175"/>
+        </w:tabs>
+      </w:pPr>
+    </w:p>
+    <w:p>
+      <w:pPr>
+        <w:tabs>
+          <w:tab w:val="left" w:pos="2175"/>
+        </w:tabs>
+      </w:pPr>
+    </w:p>
     <w:p>
       <w:pPr>
         <w:tabs>
@@ -17320,14 +17302,14 @@
         </w:pBdr>
       </w:pPr>
       <w:bookmarkStart w:id="56" w:name="_Toc230906358"/>
-      <w:bookmarkStart w:id="57" w:name="_Toc231082390"/>
-      <w:r>
+      <w:bookmarkStart w:id="57" w:name="_Toc231931749"/>
+      <w:r>
+        <w:lastRenderedPageBreak/>
         <w:t>Verification Scenarios and Tests</w:t>
       </w:r>
       <w:bookmarkEnd w:id="56"/>
       <w:bookmarkEnd w:id="57"/>
     </w:p>
-    <w:p/>
     <w:p>
       <w:pPr>
         <w:pBdr>
@@ -18006,36 +17988,8 @@
           <w:between w:val="nil"/>
         </w:pBdr>
         <w:spacing w:line="288" w:lineRule="auto"/>
-        <w:rPr>
-          <w:color w:val="000000"/>
-        </w:rPr>
-      </w:pPr>
-    </w:p>
-    <w:p>
-      <w:pPr>
-        <w:pBdr>
-          <w:top w:val="nil"/>
-          <w:left w:val="nil"/>
-          <w:bottom w:val="nil"/>
-          <w:right w:val="nil"/>
-          <w:between w:val="nil"/>
-        </w:pBdr>
-        <w:spacing w:line="288" w:lineRule="auto"/>
-        <w:rPr>
-          <w:color w:val="000000"/>
-        </w:rPr>
-      </w:pPr>
-    </w:p>
-    <w:p>
-      <w:pPr>
-        <w:pBdr>
-          <w:top w:val="nil"/>
-          <w:left w:val="nil"/>
-          <w:bottom w:val="nil"/>
-          <w:right w:val="nil"/>
-          <w:between w:val="nil"/>
-        </w:pBdr>
-        <w:spacing w:line="288" w:lineRule="auto"/>
+        <w:ind w:firstLine="720"/>
+        <w:jc w:val="both"/>
         <w:rPr>
           <w:color w:val="000000"/>
         </w:rPr>
@@ -18061,7 +18015,6 @@
         <w:rPr>
           <w:color w:val="000000"/>
         </w:rPr>
-        <w:lastRenderedPageBreak/>
         <w:t xml:space="preserve">Table </w:t>
       </w:r>
       <w:r>
@@ -18484,6 +18437,7 @@
               <w:rPr>
                 <w:lang w:val="ro-RO"/>
               </w:rPr>
+              <w:lastRenderedPageBreak/>
               <w:t>temperature_</w:t>
             </w:r>
             <w:r>
@@ -18730,7 +18684,7 @@
         </w:pBdr>
       </w:pPr>
       <w:bookmarkStart w:id="58" w:name="_Toc230906359"/>
-      <w:bookmarkStart w:id="59" w:name="_Toc231082391"/>
+      <w:bookmarkStart w:id="59" w:name="_Toc231931750"/>
       <w:r>
         <w:t>Results</w:t>
       </w:r>
@@ -18853,20 +18807,6 @@
         <w:t>n</w:t>
       </w:r>
     </w:p>
-    <w:p>
-      <w:pPr>
-        <w:pBdr>
-          <w:top w:val="none" w:sz="0" w:space="0" w:color="000000"/>
-          <w:left w:val="none" w:sz="0" w:space="0" w:color="000000"/>
-          <w:bottom w:val="none" w:sz="0" w:space="0" w:color="000000"/>
-          <w:right w:val="none" w:sz="0" w:space="0" w:color="000000"/>
-          <w:between w:val="none" w:sz="0" w:space="0" w:color="000000"/>
-        </w:pBdr>
-        <w:spacing w:after="160" w:line="288" w:lineRule="auto"/>
-        <w:jc w:val="both"/>
-      </w:pPr>
-    </w:p>
-    <w:p/>
     <w:sectPr>
       <w:headerReference w:type="even" r:id="rId14"/>
       <w:headerReference w:type="default" r:id="rId15"/>
@@ -20800,10 +20740,11 @@
   <w:abstractNum w:abstractNumId="17" w15:restartNumberingAfterBreak="0">
     <w:nsid w:val="56721AC2"/>
     <w:multiLevelType w:val="multilevel"/>
-    <w:tmpl w:val="50CC13E2"/>
+    <w:tmpl w:val="A254F3A0"/>
     <w:lvl w:ilvl="0">
       <w:start w:val="1"/>
       <w:numFmt w:val="decimal"/>
+      <w:pStyle w:val="Heading1"/>
       <w:lvlText w:val="%1"/>
       <w:lvlJc w:val="left"/>
       <w:pPr>
@@ -22348,18 +22289,22 @@
     <w:link w:val="Heading1Char"/>
     <w:uiPriority w:val="9"/>
     <w:qFormat/>
-    <w:rsid w:val="00EE7368"/>
+    <w:rsid w:val="0084381A"/>
     <w:pPr>
       <w:keepNext/>
       <w:keepLines/>
+      <w:numPr>
+        <w:numId w:val="22"/>
+      </w:numPr>
       <w:pBdr>
         <w:top w:val="none" w:sz="4" w:space="0" w:color="000000"/>
         <w:left w:val="none" w:sz="4" w:space="0" w:color="000000"/>
-        <w:bottom w:val="single" w:sz="4" w:space="1" w:color="595959" w:themeColor="text1" w:themeTint="A6"/>
+        <w:bottom w:val="none" w:sz="0" w:space="0" w:color="000000"/>
         <w:right w:val="none" w:sz="4" w:space="0" w:color="000000"/>
         <w:between w:val="none" w:sz="4" w:space="0" w:color="000000"/>
       </w:pBdr>
       <w:spacing w:before="360" w:after="160" w:line="259" w:lineRule="auto"/>
+      <w:ind w:left="720" w:right="169" w:hanging="360"/>
       <w:jc w:val="both"/>
       <w:outlineLvl w:val="0"/>
     </w:pPr>
@@ -22657,6 +22602,7 @@
   <w:style w:type="character" w:default="1" w:styleId="DefaultParagraphFont">
     <w:name w:val="Default Paragraph Font"/>
     <w:uiPriority w:val="1"/>
+    <w:semiHidden/>
     <w:unhideWhenUsed/>
   </w:style>
   <w:style w:type="table" w:default="1" w:styleId="TableNormal">
@@ -22797,16 +22743,16 @@
     <w:basedOn w:val="DefaultParagraphFont"/>
     <w:link w:val="Heading1"/>
     <w:uiPriority w:val="9"/>
-    <w:rsid w:val="00EE7368"/>
+    <w:rsid w:val="0084381A"/>
     <w:rPr>
-      <w:rFonts w:ascii="UT Sans" w:eastAsia="Cambria" w:hAnsi="UT Sans" w:cs="Cambria"/>
+      <w:rFonts w:eastAsia="Cambria" w:cs="Cambria"/>
       <w:b/>
       <w:bCs/>
       <w:smallCaps/>
       <w:color w:val="000000" w:themeColor="text1"/>
       <w:sz w:val="36"/>
       <w:szCs w:val="36"/>
-      <w:lang w:val="en-US" w:eastAsia="en-US"/>
+      <w:lang w:val="en-US"/>
     </w:rPr>
   </w:style>
   <w:style w:type="character" w:customStyle="1" w:styleId="Heading2Char">

</xml_diff>